<commit_message>
Add SQL scripts for revenue analysis and activation diagnostics
- Introduced `activation_revenue_opportunity.sql` to analyze potential revenue uplift from improved activation rates.
- Created `free_plan_activation_diagnostic.sql` to diagnose conversion issues from validation to activation for free plan users.
- Added `funnel_90d_heatmap_queries.sql` for visualizing the 90-day funnel performance across different segments.
- Developed `material_watch_at_risk_exposure_from_raw_tables.sql` to assess revenue exposure for at-risk companies.
- Enhanced `playground.sql` with various commented-out queries for exploratory analysis.
- Implemented revenue exposure calculations in `presentation_kpis.sql` with updated health state classifications.
- Refined `raw_two_table_health_analysis.sql` to improve revenue health assessment logic and added new health states.
</commit_message>
<xml_diff>
--- a/outputs/presentation/Shine_Case_3_Page_Memo.docx
+++ b/outputs/presentation/Shine_Case_3_Page_Memo.docx
@@ -30,7 +30,7 @@
           <w:color w:val="102A43"/>
           <w:sz w:val="40"/>
         </w:rPr>
-        <w:t>BTP is the strongest demonstrated vertical—not unlimited market headroom</w:t>
+        <w:t>Revenue deterioration is the clearest near-term risk</w:t>
       </w:r>
     </w:p>
     <w:p>
@@ -82,7 +82,7 @@
                 <w:color w:val="FFFFFF"/>
                 <w:sz w:val="22"/>
               </w:rPr>
-              <w:t>Across all 9,088 comparable companies, BTP contributes 26.74% of revenue and Plus generates 2.02× average revenue/company. External evidence supports BTP product fit, but sector and product constraints require a bounded causal test before scaling.</w:t>
+              <w:t>Among 6,337 mature companies, 1,909 (30.1%) are in Declining + inactive. The immediate test group is narrower: 953 (15.0%) are either Material Watch or At-risk, where Shine can intervene before a longer period without revenue.</w:t>
             </w:r>
           </w:p>
         </w:tc>
@@ -139,7 +139,7 @@
                 <w:color w:val="008C8C"/>
                 <w:sz w:val="30"/>
               </w:rPr>
-              <w:t>9,088</w:t>
+              <w:t>6,337</w:t>
             </w:r>
           </w:p>
           <w:p>
@@ -155,7 +155,7 @@
                 <w:color w:val="5E6C76"/>
                 <w:sz w:val="15"/>
               </w:rPr>
-              <w:t>companies in comparable base</w:t>
+              <w:t>mature companies assessed</w:t>
             </w:r>
           </w:p>
         </w:tc>
@@ -184,7 +184,7 @@
                 <w:color w:val="008C8C"/>
                 <w:sz w:val="30"/>
               </w:rPr>
-              <w:t>44.6%</w:t>
+              <w:t>30.1%</w:t>
             </w:r>
           </w:p>
           <w:p>
@@ -200,7 +200,7 @@
                 <w:color w:val="5E6C76"/>
                 <w:sz w:val="15"/>
               </w:rPr>
-              <w:t>all comparable revenue from Start</w:t>
+              <w:t>Declining + inactive</w:t>
             </w:r>
           </w:p>
         </w:tc>
@@ -229,7 +229,7 @@
                 <w:color w:val="008C8C"/>
                 <w:sz w:val="30"/>
               </w:rPr>
-              <w:t>26.7%</w:t>
+              <w:t>10.6%</w:t>
             </w:r>
           </w:p>
           <w:p>
@@ -245,7 +245,7 @@
                 <w:color w:val="5E6C76"/>
                 <w:sz w:val="15"/>
               </w:rPr>
-              <w:t>all comparable revenue from BTP</w:t>
+              <w:t>Material Watch • N=673</w:t>
             </w:r>
           </w:p>
         </w:tc>
@@ -274,7 +274,7 @@
                 <w:color w:val="008C8C"/>
                 <w:sz w:val="30"/>
               </w:rPr>
-              <w:t>70.2%</w:t>
+              <w:t>4.4%</w:t>
             </w:r>
           </w:p>
           <w:p>
@@ -290,7 +290,7 @@
                 <w:color w:val="5E6C76"/>
                 <w:sz w:val="15"/>
               </w:rPr>
-              <w:t>generated by top 20% — secondary</w:t>
+              <w:t>At-risk • N=280</w:t>
             </w:r>
           </w:p>
         </w:tc>
@@ -442,7 +442,7 @@
                 <w:color w:val="008C8C"/>
                 <w:sz w:val="15"/>
               </w:rPr>
-              <w:t>OPPORTUNITY</w:t>
+              <w:t>LEAD OPPORTUNITY</w:t>
             </w:r>
           </w:p>
           <w:p>
@@ -457,7 +457,7 @@
                 <w:color w:val="17212B"/>
                 <w:sz w:val="17"/>
               </w:rPr>
-              <w:t>BTP leads demonstrated persona scale and efficiency: 26.74% of revenue and 1.48× average revenue/company.</w:t>
+              <w:t>Intervene while an account is still revenue-active but materially declining, or immediately after its first revenue-free month.</w:t>
             </w:r>
           </w:p>
           <w:p>
@@ -472,7 +472,7 @@
                 <w:color w:val="17212B"/>
                 <w:sz w:val="16"/>
               </w:rPr>
-              <w:t>France has a large artisan BTP base; Shine already offers a dedicated BTP workflow.</w:t>
+              <w:t>Prioritise the largest exposures first; use low-cost automation for the long tail.</w:t>
             </w:r>
           </w:p>
         </w:tc>
@@ -515,7 +515,7 @@
                 <w:color w:val="17212B"/>
                 <w:sz w:val="17"/>
               </w:rPr>
-              <w:t>BTP activity contracted in 2025; Shine cannot directly offer overdrafts and advanced BTP invoicing is only partly supported.</w:t>
+              <w:t>Declining + inactive is a screening group—not one account state and not confirmed churn.</w:t>
             </w:r>
           </w:p>
           <w:p>
@@ -530,7 +530,7 @@
                 <w:color w:val="17212B"/>
                 <w:sz w:val="16"/>
               </w:rPr>
-              <w:t>Business reaches 3.22× average revenue/company but contributes only 6.95% (N=196); it is not the lead bet.</w:t>
+              <w:t>It also contains Declining &lt;€10 and Churned proxy, which should receive lower-cost or lower-priority treatment.</w:t>
             </w:r>
           </w:p>
         </w:tc>
@@ -741,7 +741,7 @@
           <w:color w:val="17212B"/>
           <w:sz w:val="18"/>
         </w:rPr>
-        <w:t>prioritize a controlled BTP-fit activation test, with Plus as the strongest initial-plan signal. Scale only on incremental contribution; treat 70/20 as secondary concentration context.</w:t>
+        <w:t>lead with a controlled experiment for Material Watch and At-risk companies. Prioritise by gross exposure and expected recovery—not persona alone—and keep BTP discovery second.</w:t>
       </w:r>
     </w:p>
     <w:p>
@@ -868,7 +868,7 @@
                 <w:color w:val="102A43"/>
                 <w:sz w:val="18"/>
               </w:rPr>
-              <w:t>BTP-fit activation &amp; monetization experiment</w:t>
+              <w:t>Revenue-deterioration &amp; first-gap protection</w:t>
             </w:r>
           </w:p>
           <w:p>
@@ -883,7 +883,7 @@
                 <w:color w:val="5E6C76"/>
                 <w:sz w:val="15"/>
               </w:rPr>
-              <w:t>Test a vertical workflow with suitable tradespeople and small crews; do not assume broad BTP acquisition or plan upsell is the lever.</w:t>
+              <w:t>Diagnose material declines while revenue is still active and support accounts after their first missing month; use state-specific treatments.</w:t>
             </w:r>
           </w:p>
         </w:tc>
@@ -925,7 +925,7 @@
                 <w:color w:val="17212B"/>
                 <w:sz w:val="16"/>
               </w:rPr>
-              <w:t>BTP contributes 26.74% of all comparable revenue (N=1,642; €178.85/company; 1.48× overall). In the mature BTP base, 71.07% are Healthy and 15.55% Watch.</w:t>
+              <w:t>Material Watch is 10.6% (N=673) and At-risk is 4.4% (N=280): together 15.0% of mature companies (N=953). Their gross exposure proxy is €51.1k; illustrative 10–20% recovery is €5.1k–€10.2k/month before cost—not a forecast.</w:t>
             </w:r>
           </w:p>
         </w:tc>
@@ -967,7 +967,7 @@
                 <w:color w:val="17212B"/>
                 <w:sz w:val="16"/>
               </w:rPr>
-              <w:t>Existing BTP targeting, sector contraction, financing needs, and product limits cap extrapolation. No CAC, margin, current-plan, or product-use data.</w:t>
+              <w:t>Exposure is not recoverable revenue. Product usage, cause, recovery probability, contribution margin, and treatment cost are missing.</w:t>
             </w:r>
           </w:p>
         </w:tc>
@@ -1051,7 +1051,7 @@
                 <w:color w:val="102A43"/>
                 <w:sz w:val="18"/>
               </w:rPr>
-              <w:t>Revenue-decline &amp; first-gap protection</w:t>
+              <w:t>BTP product-fit discovery experiment</w:t>
             </w:r>
           </w:p>
           <w:p>
@@ -1066,7 +1066,7 @@
                 <w:color w:val="5E6C76"/>
                 <w:sz w:val="15"/>
               </w:rPr>
-              <w:t>Trigger diagnosis at a material revenue decline and support after the first missing month; monitor recoveries.</w:t>
+              <w:t>Validate which BTP needs and product behaviours drive value before scaling acquisition, workflow activation, or upsell.</w:t>
             </w:r>
           </w:p>
         </w:tc>
@@ -1108,7 +1108,7 @@
                 <w:color w:val="17212B"/>
                 <w:sz w:val="16"/>
               </w:rPr>
-              <w:t>493 high-value accounts are Watch, with a €41.0k observed baseline-to-April gap. In the mature base, Business is only 46.15% Healthy and 43.36% inactive—but N=143.</w:t>
+              <w:t>BTP contributes 26.74% of comparable revenue (N=1,642; €178.85/company; 1.48× overall), combining attractive scale and efficiency.</w:t>
             </w:r>
           </w:p>
         </w:tc>
@@ -1150,7 +1150,7 @@
                 <w:color w:val="17212B"/>
                 <w:sz w:val="16"/>
               </w:rPr>
-              <w:t>The decline threshold is an analytical assumption, not causal loss. Product usage is missing, so diagnose the driver before outreach.</w:t>
+              <w:t>No product-use, current-plan, CAC, margin, or acquisition-channel data identifies a causal lever; sector and product constraints cap extrapolation.</w:t>
             </w:r>
           </w:p>
         </w:tc>
@@ -1280,7 +1280,7 @@
       <w:r>
         <w:drawing>
           <wp:inline xmlns:a="http://schemas.openxmlformats.org/drawingml/2006/main" xmlns:pic="http://schemas.openxmlformats.org/drawingml/2006/picture">
-            <wp:extent cx="5580000" cy="2293151"/>
+            <wp:extent cx="5940000" cy="3591149"/>
             <wp:docPr id="2" name="Picture 2"/>
             <wp:cNvGraphicFramePr>
               <a:graphicFrameLocks noChangeAspect="1"/>
@@ -1301,7 +1301,7 @@
                   <pic:spPr>
                     <a:xfrm>
                       <a:off x="0" y="0"/>
-                      <a:ext cx="5580000" cy="2293151"/>
+                      <a:ext cx="5940000" cy="3591149"/>
                     </a:xfrm>
                     <a:prstGeom prst="rect"/>
                   </pic:spPr>
@@ -1310,6 +1310,350 @@
             </a:graphic>
           </wp:inline>
         </w:drawing>
+      </w:r>
+    </w:p>
+    <w:p>
+      <w:pPr>
+        <w:spacing w:before="20" w:after="20"/>
+      </w:pPr>
+      <w:r>
+        <w:rPr>
+          <w:rFonts w:ascii="Arial" w:hAnsi="Arial"/>
+          <w:b/>
+          <w:i w:val="0"/>
+          <w:color w:val="102A43"/>
+          <w:sz w:val="15"/>
+        </w:rPr>
+        <w:t>Legend definitions</w:t>
+      </w:r>
+    </w:p>
+    <w:tbl>
+      <w:tblPr>
+        <w:tblW w:type="auto" w:w="0"/>
+        <w:tblLayout w:type="fixed"/>
+        <w:tblLook w:firstColumn="1" w:firstRow="1" w:lastColumn="0" w:lastRow="0" w:noHBand="0" w:noVBand="1" w:val="04A0"/>
+        <w:tblBorders>
+          <w:top w:val="single" w:sz="3" w:color="DDE3E8"/>
+          <w:left w:val="single" w:sz="3" w:color="DDE3E8"/>
+          <w:bottom w:val="single" w:sz="3" w:color="DDE3E8"/>
+          <w:right w:val="single" w:sz="3" w:color="DDE3E8"/>
+          <w:insideH w:val="single" w:sz="3" w:color="DDE3E8"/>
+          <w:insideV w:val="single" w:sz="3" w:color="DDE3E8"/>
+        </w:tblBorders>
+      </w:tblPr>
+      <w:tblGrid>
+        <w:gridCol w:w="5187"/>
+        <w:gridCol w:w="5187"/>
+      </w:tblGrid>
+      <w:tr>
+        <w:trPr>
+          <w:cantSplit/>
+        </w:trPr>
+        <w:tc>
+          <w:tcPr>
+            <w:tcW w:type="dxa" w:w="5244"/>
+            <w:tcMar>
+              <w:top w:w="35" w:type="dxa"/>
+              <w:start w:w="75" w:type="dxa"/>
+              <w:bottom w:w="35" w:type="dxa"/>
+              <w:end w:w="75" w:type="dxa"/>
+            </w:tcMar>
+            <w:shd w:fill="FFFFFF"/>
+          </w:tcPr>
+          <w:p>
+            <w:pPr>
+              <w:spacing w:after="0"/>
+            </w:pPr>
+            <w:r>
+              <w:rPr>
+                <w:rFonts w:ascii="Arial" w:hAnsi="Arial"/>
+                <w:b/>
+                <w:i w:val="0"/>
+                <w:color w:val="2A9D8F"/>
+                <w:sz w:val="13"/>
+              </w:rPr>
+              <w:t xml:space="preserve">Healthy / stable: </w:t>
+            </w:r>
+            <w:r>
+              <w:rPr>
+                <w:rFonts w:ascii="Arial" w:hAnsi="Arial"/>
+                <w:b w:val="0"/>
+                <w:i w:val="0"/>
+                <w:color w:val="5E6C76"/>
+                <w:sz w:val="13"/>
+              </w:rPr>
+              <w:t>revenue-active in April, uninterrupted since activation, and without a decline of 30% or more.</w:t>
+            </w:r>
+          </w:p>
+        </w:tc>
+        <w:tc>
+          <w:tcPr>
+            <w:tcW w:type="dxa" w:w="5244"/>
+            <w:tcMar>
+              <w:top w:w="35" w:type="dxa"/>
+              <w:start w:w="75" w:type="dxa"/>
+              <w:bottom w:w="35" w:type="dxa"/>
+              <w:end w:w="75" w:type="dxa"/>
+            </w:tcMar>
+            <w:shd w:fill="FFFFFF"/>
+          </w:tcPr>
+          <w:p>
+            <w:pPr>
+              <w:spacing w:after="0"/>
+            </w:pPr>
+            <w:r>
+              <w:rPr>
+                <w:rFonts w:ascii="Arial" w:hAnsi="Arial"/>
+                <w:b/>
+                <w:i w:val="0"/>
+                <w:color w:val="C58A1D"/>
+                <w:sz w:val="13"/>
+              </w:rPr>
+              <w:t xml:space="preserve">Declining &lt;€10: </w:t>
+            </w:r>
+            <w:r>
+              <w:rPr>
+                <w:rFonts w:ascii="Arial" w:hAnsi="Arial"/>
+                <w:b w:val="0"/>
+                <w:i w:val="0"/>
+                <w:color w:val="5E6C76"/>
+                <w:sz w:val="13"/>
+              </w:rPr>
+              <w:t>revenue-active and at least 30% below its prior three-month median, but by less than €10.</w:t>
+            </w:r>
+          </w:p>
+        </w:tc>
+      </w:tr>
+      <w:tr>
+        <w:trPr>
+          <w:cantSplit/>
+        </w:trPr>
+        <w:tc>
+          <w:tcPr>
+            <w:tcW w:type="dxa" w:w="5244"/>
+            <w:tcMar>
+              <w:top w:w="35" w:type="dxa"/>
+              <w:start w:w="75" w:type="dxa"/>
+              <w:bottom w:w="35" w:type="dxa"/>
+              <w:end w:w="75" w:type="dxa"/>
+            </w:tcMar>
+            <w:shd w:fill="F3F5F7"/>
+          </w:tcPr>
+          <w:p>
+            <w:pPr>
+              <w:spacing w:after="0"/>
+            </w:pPr>
+            <w:r>
+              <w:rPr>
+                <w:rFonts w:ascii="Arial" w:hAnsi="Arial"/>
+                <w:b/>
+                <w:i w:val="0"/>
+                <w:color w:val="E9A23B"/>
+                <w:sz w:val="13"/>
+              </w:rPr>
+              <w:t xml:space="preserve">Material Watch: </w:t>
+            </w:r>
+            <w:r>
+              <w:rPr>
+                <w:rFonts w:ascii="Arial" w:hAnsi="Arial"/>
+                <w:b w:val="0"/>
+                <w:i w:val="0"/>
+                <w:color w:val="5E6C76"/>
+                <w:sz w:val="13"/>
+              </w:rPr>
+              <w:t>revenue-active and at least 30% below its prior three-month median, with a decline of at least €10.</w:t>
+            </w:r>
+          </w:p>
+        </w:tc>
+        <w:tc>
+          <w:tcPr>
+            <w:tcW w:type="dxa" w:w="5244"/>
+            <w:tcMar>
+              <w:top w:w="35" w:type="dxa"/>
+              <w:start w:w="75" w:type="dxa"/>
+              <w:bottom w:w="35" w:type="dxa"/>
+              <w:end w:w="75" w:type="dxa"/>
+            </w:tcMar>
+            <w:shd w:fill="F3F5F7"/>
+          </w:tcPr>
+          <w:p>
+            <w:pPr>
+              <w:spacing w:after="0"/>
+            </w:pPr>
+            <w:r>
+              <w:rPr>
+                <w:rFonts w:ascii="Arial" w:hAnsi="Arial"/>
+                <w:b/>
+                <w:i w:val="0"/>
+                <w:color w:val="6AAED6"/>
+                <w:sz w:val="13"/>
+              </w:rPr>
+              <w:t xml:space="preserve">Recovered: </w:t>
+            </w:r>
+            <w:r>
+              <w:rPr>
+                <w:rFonts w:ascii="Arial" w:hAnsi="Arial"/>
+                <w:b w:val="0"/>
+                <w:i w:val="0"/>
+                <w:color w:val="5E6C76"/>
+                <w:sz w:val="13"/>
+              </w:rPr>
+              <w:t>revenue-active again after an observed no-revenue month since activation.</w:t>
+            </w:r>
+          </w:p>
+        </w:tc>
+      </w:tr>
+      <w:tr>
+        <w:trPr>
+          <w:cantSplit/>
+        </w:trPr>
+        <w:tc>
+          <w:tcPr>
+            <w:tcW w:type="dxa" w:w="5244"/>
+            <w:tcMar>
+              <w:top w:w="35" w:type="dxa"/>
+              <w:start w:w="75" w:type="dxa"/>
+              <w:bottom w:w="35" w:type="dxa"/>
+              <w:end w:w="75" w:type="dxa"/>
+            </w:tcMar>
+            <w:shd w:fill="FFFFFF"/>
+          </w:tcPr>
+          <w:p>
+            <w:pPr>
+              <w:spacing w:after="0"/>
+            </w:pPr>
+            <w:r>
+              <w:rPr>
+                <w:rFonts w:ascii="Arial" w:hAnsi="Arial"/>
+                <w:b/>
+                <w:i w:val="0"/>
+                <w:color w:val="E07A3F"/>
+                <w:sz w:val="13"/>
+              </w:rPr>
+              <w:t xml:space="preserve">At-risk: </w:t>
+            </w:r>
+            <w:r>
+              <w:rPr>
+                <w:rFonts w:ascii="Arial" w:hAnsi="Arial"/>
+                <w:b w:val="0"/>
+                <w:i w:val="0"/>
+                <w:color w:val="5E6C76"/>
+                <w:sz w:val="13"/>
+              </w:rPr>
+              <w:t>previously monetized, with no observed revenue for one or two months.</w:t>
+            </w:r>
+          </w:p>
+        </w:tc>
+        <w:tc>
+          <w:tcPr>
+            <w:tcW w:type="dxa" w:w="5244"/>
+            <w:tcMar>
+              <w:top w:w="35" w:type="dxa"/>
+              <w:start w:w="75" w:type="dxa"/>
+              <w:bottom w:w="35" w:type="dxa"/>
+              <w:end w:w="75" w:type="dxa"/>
+            </w:tcMar>
+            <w:shd w:fill="FFFFFF"/>
+          </w:tcPr>
+          <w:p>
+            <w:pPr>
+              <w:spacing w:after="0"/>
+            </w:pPr>
+            <w:r>
+              <w:rPr>
+                <w:rFonts w:ascii="Arial" w:hAnsi="Arial"/>
+                <w:b/>
+                <w:i w:val="0"/>
+                <w:color w:val="C95C3D"/>
+                <w:sz w:val="13"/>
+              </w:rPr>
+              <w:t xml:space="preserve">Churned proxy: </w:t>
+            </w:r>
+            <w:r>
+              <w:rPr>
+                <w:rFonts w:ascii="Arial" w:hAnsi="Arial"/>
+                <w:b w:val="0"/>
+                <w:i w:val="0"/>
+                <w:color w:val="5E6C76"/>
+                <w:sz w:val="13"/>
+              </w:rPr>
+              <w:t>previously monetized, with no observed revenue for at least three months.</w:t>
+            </w:r>
+          </w:p>
+        </w:tc>
+      </w:tr>
+      <w:tr>
+        <w:trPr>
+          <w:cantSplit/>
+        </w:trPr>
+        <w:tc>
+          <w:tcPr>
+            <w:tcW w:type="dxa" w:w="5244"/>
+            <w:tcMar>
+              <w:top w:w="35" w:type="dxa"/>
+              <w:start w:w="75" w:type="dxa"/>
+              <w:bottom w:w="35" w:type="dxa"/>
+              <w:end w:w="75" w:type="dxa"/>
+            </w:tcMar>
+            <w:shd w:fill="F3F5F7"/>
+          </w:tcPr>
+          <w:p>
+            <w:pPr>
+              <w:spacing w:after="0"/>
+            </w:pPr>
+            <w:r>
+              <w:rPr>
+                <w:rFonts w:ascii="Arial" w:hAnsi="Arial"/>
+                <w:b/>
+                <w:i w:val="0"/>
+                <w:color w:val="7A8B96"/>
+                <w:sz w:val="13"/>
+              </w:rPr>
+              <w:t xml:space="preserve">Never monetized: </w:t>
+            </w:r>
+            <w:r>
+              <w:rPr>
+                <w:rFonts w:ascii="Arial" w:hAnsi="Arial"/>
+                <w:b w:val="0"/>
+                <w:i w:val="0"/>
+                <w:color w:val="5E6C76"/>
+                <w:sz w:val="13"/>
+              </w:rPr>
+              <w:t>no revenue has been observed for the company in the available extract.</w:t>
+            </w:r>
+          </w:p>
+        </w:tc>
+        <w:tc>
+          <w:tcPr>
+            <w:tcW w:type="dxa" w:w="5244"/>
+          </w:tcPr>
+          <w:p/>
+        </w:tc>
+      </w:tr>
+    </w:tbl>
+    <w:p>
+      <w:pPr>
+        <w:spacing w:before="20" w:after="20"/>
+      </w:pPr>
+      <w:r>
+        <w:rPr>
+          <w:rFonts w:ascii="Arial" w:hAnsi="Arial"/>
+          <w:b/>
+          <w:i w:val="0"/>
+          <w:color w:val="008C8C"/>
+          <w:sz w:val="14"/>
+        </w:rPr>
+        <w:t xml:space="preserve">How to read the risk signal: </w:t>
+      </w:r>
+      <w:r>
+        <w:rPr>
+          <w:rFonts w:ascii="Arial" w:hAnsi="Arial"/>
+          <w:b w:val="0"/>
+          <w:i w:val="0"/>
+          <w:color w:val="5E6C76"/>
+          <w:sz w:val="14"/>
+        </w:rPr>
+        <w:t>The Overall bar shows 1,909 of 6,337 mature companies (30.1%) in the grouped Declining + inactive signal. This is not a separate account state: it combines Declining &lt;€10 + Material Watch + At-risk + Churned proxy. The first two remain revenue-active; At-risk means 1–2 revenue-free months and Churned proxy means 3+ after prior revenue. It excludes Healthy/stable, Recovered, and Never monetized. This is a screening indicator—not confirmed churn. N is the mature-company population.</w:t>
       </w:r>
     </w:p>
     <w:p>
@@ -1632,7 +1976,7 @@
                 <w:color w:val="102A43"/>
                 <w:sz w:val="14"/>
               </w:rPr>
-              <w:t>Blanket churn campaign</w:t>
+              <w:t>Scale BTP immediately</w:t>
             </w:r>
           </w:p>
         </w:tc>
@@ -1659,7 +2003,7 @@
                 <w:color w:val="17212B"/>
                 <w:sz w:val="14"/>
               </w:rPr>
-              <w:t>Retention feels urgent</w:t>
+              <w:t>Strong scale and efficiency</w:t>
             </w:r>
           </w:p>
         </w:tc>
@@ -1686,7 +2030,7 @@
                 <w:color w:val="17212B"/>
                 <w:sz w:val="14"/>
               </w:rPr>
-              <w:t>A decline is not churn; target the 493 Watch and 154 inactive accounts with distinct treatments.</w:t>
+              <w:t>The data identifies the segment, but not the product or acquisition lever that caused its value.</w:t>
             </w:r>
           </w:p>
         </w:tc>
@@ -1718,7 +2062,7 @@
                 <w:color w:val="102A43"/>
                 <w:sz w:val="14"/>
               </w:rPr>
-              <w:t>Immediate plan upsell</w:t>
+              <w:t>Blanket churn campaign</w:t>
             </w:r>
           </w:p>
         </w:tc>
@@ -1745,7 +2089,7 @@
                 <w:color w:val="17212B"/>
                 <w:sz w:val="14"/>
               </w:rPr>
-              <w:t>Plus/Business correlate with value</w:t>
+              <w:t>Retention feels urgent</w:t>
             </w:r>
           </w:p>
         </w:tc>
@@ -1772,7 +2116,7 @@
                 <w:color w:val="17212B"/>
                 <w:sz w:val="14"/>
               </w:rPr>
-              <w:t>Only initial plan exists; current plan and causal plan effect are unknown.</w:t>
+              <w:t>Decline and inactivity are different states; treatment should vary by state, exposure, and expected recovery.</w:t>
             </w:r>
           </w:p>
         </w:tc>
@@ -1800,7 +2144,7 @@
           <w:color w:val="5E6C76"/>
           <w:sz w:val="15"/>
         </w:rPr>
-        <w:t>populations and observed revenue can be sized; uplift, margin, CAC and causal impact cannot.</w:t>
+        <w:t>gross exposure can be sized; recoverability, uplift, contribution margin, treatment cost and causal impact cannot.</w:t>
       </w:r>
     </w:p>
     <w:p>
@@ -1867,7 +2211,7 @@
           <w:color w:val="102A43"/>
           <w:sz w:val="21"/>
         </w:rPr>
-        <w:t>Lead experiment: BTP-fit workflow activation</w:t>
+        <w:t>Lead experiment: revenue-deterioration protection</w:t>
       </w:r>
     </w:p>
     <w:tbl>
@@ -1944,7 +2288,7 @@
                 <w:color w:val="17212B"/>
                 <w:sz w:val="15"/>
               </w:rPr>
-              <w:t>A BTP-specific workflow around e-invoicing, collection, expense control, cash-flow signals, or relevant partner services causes incremental recognised revenue without worsening guardrails.</w:t>
+              <w:t>A state-specific intervention after a material decline or first revenue-free month causes incremental recognised revenue versus business-as-usual.</w:t>
             </w:r>
           </w:p>
         </w:tc>
@@ -2005,7 +2349,7 @@
                 <w:color w:val="17212B"/>
                 <w:sz w:val="15"/>
               </w:rPr>
-              <w:t>Use product need—not persona alone—to identify suitable tradespeople and small crews; freeze eligibility in a pre-period; randomise treatment vs business-as-usual; stratify by pre-revenue, cohort age, current plan and usage; analyse intention-to-treat.</w:t>
+              <w:t>Freeze monthly eligibility; stratify by state, exposure/value, cohort and segment; randomise within strata. Prioritise Material Watch and first-gap At-risk: high-touch for the largest exposures, low-cost automation for the tail, and lower-touch monitoring for Churned proxy.</w:t>
             </w:r>
           </w:p>
         </w:tc>
@@ -2066,7 +2410,7 @@
                 <w:color w:val="17212B"/>
                 <w:sz w:val="15"/>
               </w:rPr>
-              <w:t>Incremental mean total revenue per eligible company over 90 days. Report bootstrap confidence intervals plus median and winsorised sensitivities because revenue is highly skewed.</w:t>
+              <w:t>Incremental mean total revenue per eligible company over 60–90 days. Report confidence intervals plus median and winsorised sensitivities because revenue is highly skewed.</w:t>
             </w:r>
           </w:p>
         </w:tc>
@@ -2127,7 +2471,7 @@
                 <w:color w:val="17212B"/>
                 <w:sz w:val="15"/>
               </w:rPr>
-              <w:t>Scale within BTP only if the pre-registered interval supports uplift above fully loaded treatment cost with no guardrail deterioration. Test transferability separately before expanding to other personas.</w:t>
+              <w:t>Scale a treatment tier only if incremental contribution exceeds fully loaded intervention cost without guardrail deterioration. Estimate effects separately by state and value tier.</w:t>
             </w:r>
           </w:p>
         </w:tc>
@@ -2315,7 +2659,7 @@
                 <w:color w:val="102A43"/>
                 <w:sz w:val="16"/>
               </w:rPr>
-              <w:t xml:space="preserve">  Selection &amp; meaning</w:t>
+              <w:t xml:space="preserve">  Cause &amp; actionability</w:t>
             </w:r>
           </w:p>
           <w:p>
@@ -2330,7 +2674,7 @@
                 <w:color w:val="17212B"/>
                 <w:sz w:val="15"/>
               </w:rPr>
-              <w:t>Validate BTP definition, acquisition channel/spend, CAC, approval, current plan, persona history and product use.</w:t>
+              <w:t>Add product/card usage, balances, current plan, status/closure, contact eligibility and cost; diagnose why revenue declined.</w:t>
             </w:r>
           </w:p>
         </w:tc>
@@ -2768,7 +3112,7 @@
           <w:color w:val="5E6C76"/>
           <w:sz w:val="15"/>
         </w:rPr>
-        <w:t>true churn, forecast LTV, causal plan effect, CAC/payback, profitability, or complete May performance.</w:t>
+        <w:t>recoverable exposure, true churn, forecast LTV, causal plan effect, CAC/payback, profitability, or complete May performance.</w:t>
       </w:r>
     </w:p>
     <w:p>

</xml_diff>